<commit_message>
Add Math sample exam with bold red answers for DOCX and PDF, and update UI sample download options
</commit_message>
<xml_diff>
--- a/exports/Bang_dap_an_tong_hop.docx
+++ b/exports/Bang_dap_an_tong_hop.docx
@@ -186,26 +186,7 @@
                 <w:b/>
                 <w:sz w:val="21"/>
               </w:rPr>
-              <w:t>B</w:t>
-            </w:r>
-          </w:p>
-        </w:tc>
-        <w:tc>
-          <w:tcPr>
-            <w:tcW w:type="dxa" w:w="2045"/>
-            <w:shd w:fill="FFFFFF"/>
-          </w:tcPr>
-          <w:p>
-            <w:pPr>
-              <w:jc w:val="center"/>
-            </w:pPr>
-            <w:r>
-              <w:rPr>
-                <w:rFonts w:ascii="Times New Roman" w:hAnsi="Times New Roman"/>
-                <w:b/>
-                <w:sz w:val="21"/>
-              </w:rPr>
-              <w:t>B</w:t>
+              <w:t>A</w:t>
             </w:r>
           </w:p>
         </w:tc>
@@ -225,143 +206,6 @@
                 <w:sz w:val="21"/>
               </w:rPr>
               <w:t>D</w:t>
-            </w:r>
-          </w:p>
-        </w:tc>
-        <w:tc>
-          <w:tcPr>
-            <w:tcW w:type="dxa" w:w="2045"/>
-            <w:shd w:fill="FFFFFF"/>
-          </w:tcPr>
-          <w:p>
-            <w:pPr>
-              <w:jc w:val="center"/>
-            </w:pPr>
-            <w:r>
-              <w:rPr>
-                <w:rFonts w:ascii="Times New Roman" w:hAnsi="Times New Roman"/>
-                <w:b/>
-                <w:sz w:val="21"/>
-              </w:rPr>
-              <w:t>D</w:t>
-            </w:r>
-          </w:p>
-        </w:tc>
-      </w:tr>
-      <w:tr>
-        <w:tc>
-          <w:tcPr>
-            <w:tcW w:type="dxa" w:w="2045"/>
-            <w:shd w:fill="F9FAFB"/>
-          </w:tcPr>
-          <w:p>
-            <w:pPr>
-              <w:jc w:val="center"/>
-            </w:pPr>
-            <w:r>
-              <w:rPr>
-                <w:rFonts w:ascii="Times New Roman" w:hAnsi="Times New Roman"/>
-                <w:b/>
-                <w:sz w:val="21"/>
-              </w:rPr>
-              <w:t>2</w:t>
-            </w:r>
-          </w:p>
-        </w:tc>
-        <w:tc>
-          <w:tcPr>
-            <w:tcW w:type="dxa" w:w="2045"/>
-            <w:shd w:fill="F9FAFB"/>
-          </w:tcPr>
-          <w:p>
-            <w:pPr>
-              <w:jc w:val="center"/>
-            </w:pPr>
-            <w:r>
-              <w:rPr>
-                <w:rFonts w:ascii="Times New Roman" w:hAnsi="Times New Roman"/>
-                <w:b/>
-                <w:sz w:val="21"/>
-              </w:rPr>
-              <w:t>B</w:t>
-            </w:r>
-          </w:p>
-        </w:tc>
-        <w:tc>
-          <w:tcPr>
-            <w:tcW w:type="dxa" w:w="2045"/>
-            <w:shd w:fill="F9FAFB"/>
-          </w:tcPr>
-          <w:p>
-            <w:pPr>
-              <w:jc w:val="center"/>
-            </w:pPr>
-            <w:r>
-              <w:rPr>
-                <w:rFonts w:ascii="Times New Roman" w:hAnsi="Times New Roman"/>
-                <w:b/>
-                <w:sz w:val="21"/>
-              </w:rPr>
-              <w:t>B</w:t>
-            </w:r>
-          </w:p>
-        </w:tc>
-        <w:tc>
-          <w:tcPr>
-            <w:tcW w:type="dxa" w:w="2045"/>
-            <w:shd w:fill="F9FAFB"/>
-          </w:tcPr>
-          <w:p>
-            <w:pPr>
-              <w:jc w:val="center"/>
-            </w:pPr>
-            <w:r>
-              <w:rPr>
-                <w:rFonts w:ascii="Times New Roman" w:hAnsi="Times New Roman"/>
-                <w:b/>
-                <w:sz w:val="21"/>
-              </w:rPr>
-              <w:t>B</w:t>
-            </w:r>
-          </w:p>
-        </w:tc>
-        <w:tc>
-          <w:tcPr>
-            <w:tcW w:type="dxa" w:w="2045"/>
-            <w:shd w:fill="F9FAFB"/>
-          </w:tcPr>
-          <w:p>
-            <w:pPr>
-              <w:jc w:val="center"/>
-            </w:pPr>
-            <w:r>
-              <w:rPr>
-                <w:rFonts w:ascii="Times New Roman" w:hAnsi="Times New Roman"/>
-                <w:b/>
-                <w:sz w:val="21"/>
-              </w:rPr>
-              <w:t>D</w:t>
-            </w:r>
-          </w:p>
-        </w:tc>
-      </w:tr>
-      <w:tr>
-        <w:tc>
-          <w:tcPr>
-            <w:tcW w:type="dxa" w:w="2045"/>
-            <w:shd w:fill="FFFFFF"/>
-          </w:tcPr>
-          <w:p>
-            <w:pPr>
-              <w:jc w:val="center"/>
-            </w:pPr>
-            <w:r>
-              <w:rPr>
-                <w:rFonts w:ascii="Times New Roman" w:hAnsi="Times New Roman"/>
-                <w:b/>
-                <w:sz w:val="21"/>
-              </w:rPr>
-              <w:t>3</w:t>
             </w:r>
           </w:p>
         </w:tc>
@@ -403,6 +247,124 @@
             </w:r>
           </w:p>
         </w:tc>
+      </w:tr>
+      <w:tr>
+        <w:tc>
+          <w:tcPr>
+            <w:tcW w:type="dxa" w:w="2045"/>
+            <w:shd w:fill="F9FAFB"/>
+          </w:tcPr>
+          <w:p>
+            <w:pPr>
+              <w:jc w:val="center"/>
+            </w:pPr>
+            <w:r>
+              <w:rPr>
+                <w:rFonts w:ascii="Times New Roman" w:hAnsi="Times New Roman"/>
+                <w:b/>
+                <w:sz w:val="21"/>
+              </w:rPr>
+              <w:t>2</w:t>
+            </w:r>
+          </w:p>
+        </w:tc>
+        <w:tc>
+          <w:tcPr>
+            <w:tcW w:type="dxa" w:w="2045"/>
+            <w:shd w:fill="F9FAFB"/>
+          </w:tcPr>
+          <w:p>
+            <w:pPr>
+              <w:jc w:val="center"/>
+            </w:pPr>
+            <w:r>
+              <w:rPr>
+                <w:rFonts w:ascii="Times New Roman" w:hAnsi="Times New Roman"/>
+                <w:b/>
+                <w:sz w:val="21"/>
+              </w:rPr>
+              <w:t>A</w:t>
+            </w:r>
+          </w:p>
+        </w:tc>
+        <w:tc>
+          <w:tcPr>
+            <w:tcW w:type="dxa" w:w="2045"/>
+            <w:shd w:fill="F9FAFB"/>
+          </w:tcPr>
+          <w:p>
+            <w:pPr>
+              <w:jc w:val="center"/>
+            </w:pPr>
+            <w:r>
+              <w:rPr>
+                <w:rFonts w:ascii="Times New Roman" w:hAnsi="Times New Roman"/>
+                <w:b/>
+                <w:sz w:val="21"/>
+              </w:rPr>
+              <w:t>C</w:t>
+            </w:r>
+          </w:p>
+        </w:tc>
+        <w:tc>
+          <w:tcPr>
+            <w:tcW w:type="dxa" w:w="2045"/>
+            <w:shd w:fill="F9FAFB"/>
+          </w:tcPr>
+          <w:p>
+            <w:pPr>
+              <w:jc w:val="center"/>
+            </w:pPr>
+            <w:r>
+              <w:rPr>
+                <w:rFonts w:ascii="Times New Roman" w:hAnsi="Times New Roman"/>
+                <w:b/>
+                <w:sz w:val="21"/>
+              </w:rPr>
+              <w:t>B</w:t>
+            </w:r>
+          </w:p>
+        </w:tc>
+        <w:tc>
+          <w:tcPr>
+            <w:tcW w:type="dxa" w:w="2045"/>
+            <w:shd w:fill="F9FAFB"/>
+          </w:tcPr>
+          <w:p>
+            <w:pPr>
+              <w:jc w:val="center"/>
+            </w:pPr>
+            <w:r>
+              <w:rPr>
+                <w:rFonts w:ascii="Times New Roman" w:hAnsi="Times New Roman"/>
+                <w:b/>
+                <w:sz w:val="21"/>
+              </w:rPr>
+              <w:t>A</w:t>
+            </w:r>
+          </w:p>
+        </w:tc>
+      </w:tr>
+      <w:tr>
+        <w:tc>
+          <w:tcPr>
+            <w:tcW w:type="dxa" w:w="2045"/>
+            <w:shd w:fill="FFFFFF"/>
+          </w:tcPr>
+          <w:p>
+            <w:pPr>
+              <w:jc w:val="center"/>
+            </w:pPr>
+            <w:r>
+              <w:rPr>
+                <w:rFonts w:ascii="Times New Roman" w:hAnsi="Times New Roman"/>
+                <w:b/>
+                <w:sz w:val="21"/>
+              </w:rPr>
+              <w:t>3</w:t>
+            </w:r>
+          </w:p>
+        </w:tc>
         <w:tc>
           <w:tcPr>
             <w:tcW w:type="dxa" w:w="2045"/>
@@ -437,7 +399,45 @@
                 <w:b/>
                 <w:sz w:val="21"/>
               </w:rPr>
-              <w:t>A</w:t>
+              <w:t>B</w:t>
+            </w:r>
+          </w:p>
+        </w:tc>
+        <w:tc>
+          <w:tcPr>
+            <w:tcW w:type="dxa" w:w="2045"/>
+            <w:shd w:fill="FFFFFF"/>
+          </w:tcPr>
+          <w:p>
+            <w:pPr>
+              <w:jc w:val="center"/>
+            </w:pPr>
+            <w:r>
+              <w:rPr>
+                <w:rFonts w:ascii="Times New Roman" w:hAnsi="Times New Roman"/>
+                <w:b/>
+                <w:sz w:val="21"/>
+              </w:rPr>
+              <w:t>B</w:t>
+            </w:r>
+          </w:p>
+        </w:tc>
+        <w:tc>
+          <w:tcPr>
+            <w:tcW w:type="dxa" w:w="2045"/>
+            <w:shd w:fill="FFFFFF"/>
+          </w:tcPr>
+          <w:p>
+            <w:pPr>
+              <w:jc w:val="center"/>
+            </w:pPr>
+            <w:r>
+              <w:rPr>
+                <w:rFonts w:ascii="Times New Roman" w:hAnsi="Times New Roman"/>
+                <w:b/>
+                <w:sz w:val="21"/>
+              </w:rPr>
+              <w:t>B</w:t>
             </w:r>
           </w:p>
         </w:tc>
@@ -477,25 +477,6 @@
                 <w:b/>
                 <w:sz w:val="21"/>
               </w:rPr>
-              <w:t>D</w:t>
-            </w:r>
-          </w:p>
-        </w:tc>
-        <w:tc>
-          <w:tcPr>
-            <w:tcW w:type="dxa" w:w="2045"/>
-            <w:shd w:fill="F9FAFB"/>
-          </w:tcPr>
-          <w:p>
-            <w:pPr>
-              <w:jc w:val="center"/>
-            </w:pPr>
-            <w:r>
-              <w:rPr>
-                <w:rFonts w:ascii="Times New Roman" w:hAnsi="Times New Roman"/>
-                <w:b/>
-                <w:sz w:val="21"/>
-              </w:rPr>
               <w:t>B</w:t>
             </w:r>
           </w:p>
@@ -515,7 +496,7 @@
                 <w:b/>
                 <w:sz w:val="21"/>
               </w:rPr>
-              <w:t>B</w:t>
+              <w:t>C</w:t>
             </w:r>
           </w:p>
         </w:tc>
@@ -534,7 +515,26 @@
                 <w:b/>
                 <w:sz w:val="21"/>
               </w:rPr>
-              <w:t>B</w:t>
+              <w:t>C</w:t>
+            </w:r>
+          </w:p>
+        </w:tc>
+        <w:tc>
+          <w:tcPr>
+            <w:tcW w:type="dxa" w:w="2045"/>
+            <w:shd w:fill="F9FAFB"/>
+          </w:tcPr>
+          <w:p>
+            <w:pPr>
+              <w:jc w:val="center"/>
+            </w:pPr>
+            <w:r>
+              <w:rPr>
+                <w:rFonts w:ascii="Times New Roman" w:hAnsi="Times New Roman"/>
+                <w:b/>
+                <w:sz w:val="21"/>
+              </w:rPr>
+              <w:t>A</w:t>
             </w:r>
           </w:p>
         </w:tc>
@@ -574,6 +574,25 @@
                 <w:b/>
                 <w:sz w:val="21"/>
               </w:rPr>
+              <w:t>C</w:t>
+            </w:r>
+          </w:p>
+        </w:tc>
+        <w:tc>
+          <w:tcPr>
+            <w:tcW w:type="dxa" w:w="2045"/>
+            <w:shd w:fill="FFFFFF"/>
+          </w:tcPr>
+          <w:p>
+            <w:pPr>
+              <w:jc w:val="center"/>
+            </w:pPr>
+            <w:r>
+              <w:rPr>
+                <w:rFonts w:ascii="Times New Roman" w:hAnsi="Times New Roman"/>
+                <w:b/>
+                <w:sz w:val="21"/>
+              </w:rPr>
               <w:t>D</w:t>
             </w:r>
           </w:p>
@@ -593,26 +612,7 @@
                 <w:b/>
                 <w:sz w:val="21"/>
               </w:rPr>
-              <w:t>A</w:t>
-            </w:r>
-          </w:p>
-        </w:tc>
-        <w:tc>
-          <w:tcPr>
-            <w:tcW w:type="dxa" w:w="2045"/>
-            <w:shd w:fill="FFFFFF"/>
-          </w:tcPr>
-          <w:p>
-            <w:pPr>
-              <w:jc w:val="center"/>
-            </w:pPr>
-            <w:r>
-              <w:rPr>
-                <w:rFonts w:ascii="Times New Roman" w:hAnsi="Times New Roman"/>
-                <w:b/>
-                <w:sz w:val="21"/>
-              </w:rPr>
-              <w:t>A</w:t>
+              <w:t>B</w:t>
             </w:r>
           </w:p>
         </w:tc>
@@ -690,6 +690,25 @@
                 <w:b/>
                 <w:sz w:val="21"/>
               </w:rPr>
+              <w:t>A</w:t>
+            </w:r>
+          </w:p>
+        </w:tc>
+        <w:tc>
+          <w:tcPr>
+            <w:tcW w:type="dxa" w:w="2045"/>
+            <w:shd w:fill="F9FAFB"/>
+          </w:tcPr>
+          <w:p>
+            <w:pPr>
+              <w:jc w:val="center"/>
+            </w:pPr>
+            <w:r>
+              <w:rPr>
+                <w:rFonts w:ascii="Times New Roman" w:hAnsi="Times New Roman"/>
+                <w:b/>
+                <w:sz w:val="21"/>
+              </w:rPr>
               <w:t>C</w:t>
             </w:r>
           </w:p>
@@ -709,26 +728,7 @@
                 <w:b/>
                 <w:sz w:val="21"/>
               </w:rPr>
-              <w:t>D</w:t>
-            </w:r>
-          </w:p>
-        </w:tc>
-        <w:tc>
-          <w:tcPr>
-            <w:tcW w:type="dxa" w:w="2045"/>
-            <w:shd w:fill="F9FAFB"/>
-          </w:tcPr>
-          <w:p>
-            <w:pPr>
-              <w:jc w:val="center"/>
-            </w:pPr>
-            <w:r>
-              <w:rPr>
-                <w:rFonts w:ascii="Times New Roman" w:hAnsi="Times New Roman"/>
-                <w:b/>
-                <w:sz w:val="21"/>
-              </w:rPr>
-              <w:t>C</w:t>
+              <w:t>B</w:t>
             </w:r>
           </w:p>
         </w:tc>
@@ -894,10 +894,190 @@
             <w:r>
               <w:rPr>
                 <w:rFonts w:ascii="Times New Roman" w:hAnsi="Times New Roman"/>
+                <w:b/>
+                <w:color w:val="047857"/>
+                <w:sz w:val="21"/>
+              </w:rPr>
+              <w:t>Đ</w:t>
+            </w:r>
+          </w:p>
+        </w:tc>
+        <w:tc>
+          <w:tcPr>
+            <w:tcW w:type="dxa" w:w="2045"/>
+            <w:shd w:fill="FFFFFF"/>
+          </w:tcPr>
+          <w:p>
+            <w:pPr>
+              <w:jc w:val="center"/>
+            </w:pPr>
+            <w:r>
+              <w:rPr>
+                <w:rFonts w:ascii="Times New Roman" w:hAnsi="Times New Roman"/>
+                <w:b/>
+                <w:color w:val="047857"/>
+                <w:sz w:val="21"/>
+              </w:rPr>
+              <w:t>Đ</w:t>
+            </w:r>
+          </w:p>
+        </w:tc>
+        <w:tc>
+          <w:tcPr>
+            <w:tcW w:type="dxa" w:w="2045"/>
+            <w:shd w:fill="FFFFFF"/>
+          </w:tcPr>
+          <w:p>
+            <w:pPr>
+              <w:jc w:val="center"/>
+            </w:pPr>
+            <w:r>
+              <w:rPr>
+                <w:rFonts w:ascii="Times New Roman" w:hAnsi="Times New Roman"/>
+                <w:b/>
+                <w:color w:val="047857"/>
+                <w:sz w:val="21"/>
+              </w:rPr>
+              <w:t>Đ</w:t>
+            </w:r>
+          </w:p>
+        </w:tc>
+        <w:tc>
+          <w:tcPr>
+            <w:tcW w:type="dxa" w:w="2045"/>
+            <w:shd w:fill="FFFFFF"/>
+          </w:tcPr>
+          <w:p>
+            <w:pPr>
+              <w:jc w:val="center"/>
+            </w:pPr>
+            <w:r>
+              <w:rPr>
+                <w:rFonts w:ascii="Times New Roman" w:hAnsi="Times New Roman"/>
                 <w:b w:val="0"/>
                 <w:sz w:val="21"/>
               </w:rPr>
               <w:t>S</w:t>
+            </w:r>
+          </w:p>
+        </w:tc>
+      </w:tr>
+      <w:tr>
+        <w:tc>
+          <w:tcPr>
+            <w:tcW w:type="dxa" w:w="2045"/>
+            <w:shd w:fill="F0FDF4"/>
+          </w:tcPr>
+          <w:p>
+            <w:pPr>
+              <w:jc w:val="center"/>
+            </w:pPr>
+            <w:r>
+              <w:rPr>
+                <w:rFonts w:ascii="Times New Roman" w:hAnsi="Times New Roman"/>
+                <w:b/>
+                <w:sz w:val="21"/>
+              </w:rPr>
+              <w:t>Câu 1.b</w:t>
+            </w:r>
+          </w:p>
+        </w:tc>
+        <w:tc>
+          <w:tcPr>
+            <w:tcW w:type="dxa" w:w="2045"/>
+            <w:shd w:fill="F0FDF4"/>
+          </w:tcPr>
+          <w:p>
+            <w:pPr>
+              <w:jc w:val="center"/>
+            </w:pPr>
+            <w:r>
+              <w:rPr>
+                <w:rFonts w:ascii="Times New Roman" w:hAnsi="Times New Roman"/>
+                <w:b/>
+                <w:color w:val="047857"/>
+                <w:sz w:val="21"/>
+              </w:rPr>
+              <w:t>Đ</w:t>
+            </w:r>
+          </w:p>
+        </w:tc>
+        <w:tc>
+          <w:tcPr>
+            <w:tcW w:type="dxa" w:w="2045"/>
+            <w:shd w:fill="F0FDF4"/>
+          </w:tcPr>
+          <w:p>
+            <w:pPr>
+              <w:jc w:val="center"/>
+            </w:pPr>
+            <w:r>
+              <w:rPr>
+                <w:rFonts w:ascii="Times New Roman" w:hAnsi="Times New Roman"/>
+                <w:b w:val="0"/>
+                <w:sz w:val="21"/>
+              </w:rPr>
+              <w:t>S</w:t>
+            </w:r>
+          </w:p>
+        </w:tc>
+        <w:tc>
+          <w:tcPr>
+            <w:tcW w:type="dxa" w:w="2045"/>
+            <w:shd w:fill="F0FDF4"/>
+          </w:tcPr>
+          <w:p>
+            <w:pPr>
+              <w:jc w:val="center"/>
+            </w:pPr>
+            <w:r>
+              <w:rPr>
+                <w:rFonts w:ascii="Times New Roman" w:hAnsi="Times New Roman"/>
+                <w:b w:val="0"/>
+                <w:sz w:val="21"/>
+              </w:rPr>
+              <w:t>S</w:t>
+            </w:r>
+          </w:p>
+        </w:tc>
+        <w:tc>
+          <w:tcPr>
+            <w:tcW w:type="dxa" w:w="2045"/>
+            <w:shd w:fill="F0FDF4"/>
+          </w:tcPr>
+          <w:p>
+            <w:pPr>
+              <w:jc w:val="center"/>
+            </w:pPr>
+            <w:r>
+              <w:rPr>
+                <w:rFonts w:ascii="Times New Roman" w:hAnsi="Times New Roman"/>
+                <w:b/>
+                <w:color w:val="047857"/>
+                <w:sz w:val="21"/>
+              </w:rPr>
+              <w:t>Đ</w:t>
+            </w:r>
+          </w:p>
+        </w:tc>
+      </w:tr>
+      <w:tr>
+        <w:tc>
+          <w:tcPr>
+            <w:tcW w:type="dxa" w:w="2045"/>
+            <w:shd w:fill="FFFFFF"/>
+          </w:tcPr>
+          <w:p>
+            <w:pPr>
+              <w:jc w:val="center"/>
+            </w:pPr>
+            <w:r>
+              <w:rPr>
+                <w:rFonts w:ascii="Times New Roman" w:hAnsi="Times New Roman"/>
+                <w:b/>
+                <w:sz w:val="21"/>
+              </w:rPr>
+              <w:t>Câu 1.c</w:t>
             </w:r>
           </w:p>
         </w:tc>
@@ -959,6 +1139,26 @@
             </w:r>
           </w:p>
         </w:tc>
+        <w:tc>
+          <w:tcPr>
+            <w:tcW w:type="dxa" w:w="2045"/>
+            <w:shd w:fill="FFFFFF"/>
+          </w:tcPr>
+          <w:p>
+            <w:pPr>
+              <w:jc w:val="center"/>
+            </w:pPr>
+            <w:r>
+              <w:rPr>
+                <w:rFonts w:ascii="Times New Roman" w:hAnsi="Times New Roman"/>
+                <w:b/>
+                <w:color w:val="047857"/>
+                <w:sz w:val="21"/>
+              </w:rPr>
+              <w:t>Đ</w:t>
+            </w:r>
+          </w:p>
+        </w:tc>
       </w:tr>
       <w:tr>
         <w:tc>
@@ -976,7 +1176,7 @@
                 <w:b/>
                 <w:sz w:val="21"/>
               </w:rPr>
-              <w:t>Câu 1.b</w:t>
+              <w:t>Câu 1.d</w:t>
             </w:r>
           </w:p>
         </w:tc>
@@ -1031,11 +1231,10 @@
             <w:r>
               <w:rPr>
                 <w:rFonts w:ascii="Times New Roman" w:hAnsi="Times New Roman"/>
-                <w:b/>
-                <w:color w:val="047857"/>
+                <w:b w:val="0"/>
                 <w:sz w:val="21"/>
               </w:rPr>
-              <w:t>Đ</w:t>
+              <w:t>S</w:t>
             </w:r>
           </w:p>
         </w:tc>
@@ -1075,7 +1274,7 @@
                 <w:b/>
                 <w:sz w:val="21"/>
               </w:rPr>
-              <w:t>Câu 1.c</w:t>
+              <w:t>Câu 2.a</w:t>
             </w:r>
           </w:p>
         </w:tc>
@@ -1091,11 +1290,10 @@
             <w:r>
               <w:rPr>
                 <w:rFonts w:ascii="Times New Roman" w:hAnsi="Times New Roman"/>
-                <w:b/>
-                <w:color w:val="047857"/>
+                <w:b w:val="0"/>
                 <w:sz w:val="21"/>
               </w:rPr>
-              <w:t>Đ</w:t>
+              <w:t>S</w:t>
             </w:r>
           </w:p>
         </w:tc>
@@ -1173,7 +1371,7 @@
                 <w:b/>
                 <w:sz w:val="21"/>
               </w:rPr>
-              <w:t>Câu 1.d</w:t>
+              <w:t>Câu 2.b</w:t>
             </w:r>
           </w:p>
         </w:tc>
@@ -1274,7 +1472,7 @@
                 <w:b/>
                 <w:sz w:val="21"/>
               </w:rPr>
-              <w:t>Câu 2.a</w:t>
+              <w:t>Câu 2.c</w:t>
             </w:r>
           </w:p>
         </w:tc>
@@ -1295,203 +1493,6 @@
                 <w:sz w:val="21"/>
               </w:rPr>
               <w:t>Đ</w:t>
-            </w:r>
-          </w:p>
-        </w:tc>
-        <w:tc>
-          <w:tcPr>
-            <w:tcW w:type="dxa" w:w="2045"/>
-            <w:shd w:fill="FFFFFF"/>
-          </w:tcPr>
-          <w:p>
-            <w:pPr>
-              <w:jc w:val="center"/>
-            </w:pPr>
-            <w:r>
-              <w:rPr>
-                <w:rFonts w:ascii="Times New Roman" w:hAnsi="Times New Roman"/>
-                <w:b w:val="0"/>
-                <w:sz w:val="21"/>
-              </w:rPr>
-              <w:t>S</w:t>
-            </w:r>
-          </w:p>
-        </w:tc>
-        <w:tc>
-          <w:tcPr>
-            <w:tcW w:type="dxa" w:w="2045"/>
-            <w:shd w:fill="FFFFFF"/>
-          </w:tcPr>
-          <w:p>
-            <w:pPr>
-              <w:jc w:val="center"/>
-            </w:pPr>
-            <w:r>
-              <w:rPr>
-                <w:rFonts w:ascii="Times New Roman" w:hAnsi="Times New Roman"/>
-                <w:b/>
-                <w:color w:val="047857"/>
-                <w:sz w:val="21"/>
-              </w:rPr>
-              <w:t>Đ</w:t>
-            </w:r>
-          </w:p>
-        </w:tc>
-        <w:tc>
-          <w:tcPr>
-            <w:tcW w:type="dxa" w:w="2045"/>
-            <w:shd w:fill="FFFFFF"/>
-          </w:tcPr>
-          <w:p>
-            <w:pPr>
-              <w:jc w:val="center"/>
-            </w:pPr>
-            <w:r>
-              <w:rPr>
-                <w:rFonts w:ascii="Times New Roman" w:hAnsi="Times New Roman"/>
-                <w:b w:val="0"/>
-                <w:sz w:val="21"/>
-              </w:rPr>
-              <w:t>S</w:t>
-            </w:r>
-          </w:p>
-        </w:tc>
-      </w:tr>
-      <w:tr>
-        <w:tc>
-          <w:tcPr>
-            <w:tcW w:type="dxa" w:w="2045"/>
-            <w:shd w:fill="F0FDF4"/>
-          </w:tcPr>
-          <w:p>
-            <w:pPr>
-              <w:jc w:val="center"/>
-            </w:pPr>
-            <w:r>
-              <w:rPr>
-                <w:rFonts w:ascii="Times New Roman" w:hAnsi="Times New Roman"/>
-                <w:b/>
-                <w:sz w:val="21"/>
-              </w:rPr>
-              <w:t>Câu 2.b</w:t>
-            </w:r>
-          </w:p>
-        </w:tc>
-        <w:tc>
-          <w:tcPr>
-            <w:tcW w:type="dxa" w:w="2045"/>
-            <w:shd w:fill="F0FDF4"/>
-          </w:tcPr>
-          <w:p>
-            <w:pPr>
-              <w:jc w:val="center"/>
-            </w:pPr>
-            <w:r>
-              <w:rPr>
-                <w:rFonts w:ascii="Times New Roman" w:hAnsi="Times New Roman"/>
-                <w:b w:val="0"/>
-                <w:sz w:val="21"/>
-              </w:rPr>
-              <w:t>S</w:t>
-            </w:r>
-          </w:p>
-        </w:tc>
-        <w:tc>
-          <w:tcPr>
-            <w:tcW w:type="dxa" w:w="2045"/>
-            <w:shd w:fill="F0FDF4"/>
-          </w:tcPr>
-          <w:p>
-            <w:pPr>
-              <w:jc w:val="center"/>
-            </w:pPr>
-            <w:r>
-              <w:rPr>
-                <w:rFonts w:ascii="Times New Roman" w:hAnsi="Times New Roman"/>
-                <w:b w:val="0"/>
-                <w:sz w:val="21"/>
-              </w:rPr>
-              <w:t>S</w:t>
-            </w:r>
-          </w:p>
-        </w:tc>
-        <w:tc>
-          <w:tcPr>
-            <w:tcW w:type="dxa" w:w="2045"/>
-            <w:shd w:fill="F0FDF4"/>
-          </w:tcPr>
-          <w:p>
-            <w:pPr>
-              <w:jc w:val="center"/>
-            </w:pPr>
-            <w:r>
-              <w:rPr>
-                <w:rFonts w:ascii="Times New Roman" w:hAnsi="Times New Roman"/>
-                <w:b/>
-                <w:color w:val="047857"/>
-                <w:sz w:val="21"/>
-              </w:rPr>
-              <w:t>Đ</w:t>
-            </w:r>
-          </w:p>
-        </w:tc>
-        <w:tc>
-          <w:tcPr>
-            <w:tcW w:type="dxa" w:w="2045"/>
-            <w:shd w:fill="F0FDF4"/>
-          </w:tcPr>
-          <w:p>
-            <w:pPr>
-              <w:jc w:val="center"/>
-            </w:pPr>
-            <w:r>
-              <w:rPr>
-                <w:rFonts w:ascii="Times New Roman" w:hAnsi="Times New Roman"/>
-                <w:b/>
-                <w:color w:val="047857"/>
-                <w:sz w:val="21"/>
-              </w:rPr>
-              <w:t>Đ</w:t>
-            </w:r>
-          </w:p>
-        </w:tc>
-      </w:tr>
-      <w:tr>
-        <w:tc>
-          <w:tcPr>
-            <w:tcW w:type="dxa" w:w="2045"/>
-            <w:shd w:fill="FFFFFF"/>
-          </w:tcPr>
-          <w:p>
-            <w:pPr>
-              <w:jc w:val="center"/>
-            </w:pPr>
-            <w:r>
-              <w:rPr>
-                <w:rFonts w:ascii="Times New Roman" w:hAnsi="Times New Roman"/>
-                <w:b/>
-                <w:sz w:val="21"/>
-              </w:rPr>
-              <w:t>Câu 2.c</w:t>
-            </w:r>
-          </w:p>
-        </w:tc>
-        <w:tc>
-          <w:tcPr>
-            <w:tcW w:type="dxa" w:w="2045"/>
-            <w:shd w:fill="FFFFFF"/>
-          </w:tcPr>
-          <w:p>
-            <w:pPr>
-              <w:jc w:val="center"/>
-            </w:pPr>
-            <w:r>
-              <w:rPr>
-                <w:rFonts w:ascii="Times New Roman" w:hAnsi="Times New Roman"/>
-                <w:b w:val="0"/>
-                <w:sz w:val="21"/>
-              </w:rPr>
-              <w:t>S</w:t>
             </w:r>
           </w:p>
         </w:tc>
@@ -1586,11 +1587,29 @@
             <w:r>
               <w:rPr>
                 <w:rFonts w:ascii="Times New Roman" w:hAnsi="Times New Roman"/>
-                <w:b/>
-                <w:color w:val="047857"/>
+                <w:b w:val="0"/>
                 <w:sz w:val="21"/>
               </w:rPr>
-              <w:t>Đ</w:t>
+              <w:t>S</w:t>
+            </w:r>
+          </w:p>
+        </w:tc>
+        <w:tc>
+          <w:tcPr>
+            <w:tcW w:type="dxa" w:w="2045"/>
+            <w:shd w:fill="F0FDF4"/>
+          </w:tcPr>
+          <w:p>
+            <w:pPr>
+              <w:jc w:val="center"/>
+            </w:pPr>
+            <w:r>
+              <w:rPr>
+                <w:rFonts w:ascii="Times New Roman" w:hAnsi="Times New Roman"/>
+                <w:b w:val="0"/>
+                <w:sz w:val="21"/>
+              </w:rPr>
+              <w:t>S</w:t>
             </w:r>
           </w:p>
         </w:tc>
@@ -1611,25 +1630,6 @@
                 <w:sz w:val="21"/>
               </w:rPr>
               <w:t>Đ</w:t>
-            </w:r>
-          </w:p>
-        </w:tc>
-        <w:tc>
-          <w:tcPr>
-            <w:tcW w:type="dxa" w:w="2045"/>
-            <w:shd w:fill="F0FDF4"/>
-          </w:tcPr>
-          <w:p>
-            <w:pPr>
-              <w:jc w:val="center"/>
-            </w:pPr>
-            <w:r>
-              <w:rPr>
-                <w:rFonts w:ascii="Times New Roman" w:hAnsi="Times New Roman"/>
-                <w:b w:val="0"/>
-                <w:sz w:val="21"/>
-              </w:rPr>
-              <w:t>S</w:t>
             </w:r>
           </w:p>
         </w:tc>
@@ -1818,182 +1818,7 @@
                 <w:b/>
                 <w:sz w:val="21"/>
               </w:rPr>
-              <w:t>12</w:t>
-            </w:r>
-          </w:p>
-        </w:tc>
-        <w:tc>
-          <w:tcPr>
-            <w:tcW w:type="dxa" w:w="2045"/>
-            <w:shd w:fill="FFFFFF"/>
-          </w:tcPr>
-          <w:p>
-            <w:pPr>
-              <w:jc w:val="center"/>
-            </w:pPr>
-            <w:r>
-              <w:rPr>
-                <w:rFonts w:ascii="Times New Roman" w:hAnsi="Times New Roman"/>
-                <w:b/>
-                <w:sz w:val="21"/>
-              </w:rPr>
-              <w:t>12</w:t>
-            </w:r>
-          </w:p>
-        </w:tc>
-        <w:tc>
-          <w:tcPr>
-            <w:tcW w:type="dxa" w:w="2045"/>
-            <w:shd w:fill="FFFFFF"/>
-          </w:tcPr>
-          <w:p>
-            <w:pPr>
-              <w:jc w:val="center"/>
-            </w:pPr>
-            <w:r>
-              <w:rPr>
-                <w:rFonts w:ascii="Times New Roman" w:hAnsi="Times New Roman"/>
-                <w:b/>
-                <w:sz w:val="21"/>
-              </w:rPr>
-              <w:t>9</w:t>
-            </w:r>
-          </w:p>
-        </w:tc>
-        <w:tc>
-          <w:tcPr>
-            <w:tcW w:type="dxa" w:w="2045"/>
-            <w:shd w:fill="FFFFFF"/>
-          </w:tcPr>
-          <w:p>
-            <w:pPr>
-              <w:jc w:val="center"/>
-            </w:pPr>
-            <w:r>
-              <w:rPr>
-                <w:rFonts w:ascii="Times New Roman" w:hAnsi="Times New Roman"/>
-                <w:b/>
-                <w:sz w:val="21"/>
-              </w:rPr>
               <w:t>3</w:t>
-            </w:r>
-          </w:p>
-        </w:tc>
-      </w:tr>
-      <w:tr>
-        <w:tc>
-          <w:tcPr>
-            <w:tcW w:type="dxa" w:w="2045"/>
-            <w:shd w:fill="FFFBEB"/>
-          </w:tcPr>
-          <w:p>
-            <w:pPr>
-              <w:jc w:val="center"/>
-            </w:pPr>
-            <w:r>
-              <w:rPr>
-                <w:rFonts w:ascii="Times New Roman" w:hAnsi="Times New Roman"/>
-                <w:b/>
-                <w:sz w:val="21"/>
-              </w:rPr>
-              <w:t>Câu 2</w:t>
-            </w:r>
-          </w:p>
-        </w:tc>
-        <w:tc>
-          <w:tcPr>
-            <w:tcW w:type="dxa" w:w="2045"/>
-            <w:shd w:fill="FFFBEB"/>
-          </w:tcPr>
-          <w:p>
-            <w:pPr>
-              <w:jc w:val="center"/>
-            </w:pPr>
-            <w:r>
-              <w:rPr>
-                <w:rFonts w:ascii="Times New Roman" w:hAnsi="Times New Roman"/>
-                <w:b/>
-                <w:sz w:val="21"/>
-              </w:rPr>
-              <w:t>3</w:t>
-            </w:r>
-          </w:p>
-        </w:tc>
-        <w:tc>
-          <w:tcPr>
-            <w:tcW w:type="dxa" w:w="2045"/>
-            <w:shd w:fill="FFFBEB"/>
-          </w:tcPr>
-          <w:p>
-            <w:pPr>
-              <w:jc w:val="center"/>
-            </w:pPr>
-            <w:r>
-              <w:rPr>
-                <w:rFonts w:ascii="Times New Roman" w:hAnsi="Times New Roman"/>
-                <w:b/>
-                <w:sz w:val="21"/>
-              </w:rPr>
-              <w:t>9</w:t>
-            </w:r>
-          </w:p>
-        </w:tc>
-        <w:tc>
-          <w:tcPr>
-            <w:tcW w:type="dxa" w:w="2045"/>
-            <w:shd w:fill="FFFBEB"/>
-          </w:tcPr>
-          <w:p>
-            <w:pPr>
-              <w:jc w:val="center"/>
-            </w:pPr>
-            <w:r>
-              <w:rPr>
-                <w:rFonts w:ascii="Times New Roman" w:hAnsi="Times New Roman"/>
-                <w:b/>
-                <w:sz w:val="21"/>
-              </w:rPr>
-              <w:t>3</w:t>
-            </w:r>
-          </w:p>
-        </w:tc>
-        <w:tc>
-          <w:tcPr>
-            <w:tcW w:type="dxa" w:w="2045"/>
-            <w:shd w:fill="FFFBEB"/>
-          </w:tcPr>
-          <w:p>
-            <w:pPr>
-              <w:jc w:val="center"/>
-            </w:pPr>
-            <w:r>
-              <w:rPr>
-                <w:rFonts w:ascii="Times New Roman" w:hAnsi="Times New Roman"/>
-                <w:b/>
-                <w:sz w:val="21"/>
-              </w:rPr>
-              <w:t>9</w:t>
-            </w:r>
-          </w:p>
-        </w:tc>
-      </w:tr>
-      <w:tr>
-        <w:tc>
-          <w:tcPr>
-            <w:tcW w:type="dxa" w:w="2045"/>
-            <w:shd w:fill="FFFFFF"/>
-          </w:tcPr>
-          <w:p>
-            <w:pPr>
-              <w:jc w:val="center"/>
-            </w:pPr>
-            <w:r>
-              <w:rPr>
-                <w:rFonts w:ascii="Times New Roman" w:hAnsi="Times New Roman"/>
-                <w:b/>
-                <w:sz w:val="21"/>
-              </w:rPr>
-              <w:t>Câu 3</w:t>
             </w:r>
           </w:p>
         </w:tc>
@@ -2054,6 +1879,143 @@
             </w:r>
           </w:p>
         </w:tc>
+      </w:tr>
+      <w:tr>
+        <w:tc>
+          <w:tcPr>
+            <w:tcW w:type="dxa" w:w="2045"/>
+            <w:shd w:fill="FFFBEB"/>
+          </w:tcPr>
+          <w:p>
+            <w:pPr>
+              <w:jc w:val="center"/>
+            </w:pPr>
+            <w:r>
+              <w:rPr>
+                <w:rFonts w:ascii="Times New Roman" w:hAnsi="Times New Roman"/>
+                <w:b/>
+                <w:sz w:val="21"/>
+              </w:rPr>
+              <w:t>Câu 2</w:t>
+            </w:r>
+          </w:p>
+        </w:tc>
+        <w:tc>
+          <w:tcPr>
+            <w:tcW w:type="dxa" w:w="2045"/>
+            <w:shd w:fill="FFFBEB"/>
+          </w:tcPr>
+          <w:p>
+            <w:pPr>
+              <w:jc w:val="center"/>
+            </w:pPr>
+            <w:r>
+              <w:rPr>
+                <w:rFonts w:ascii="Times New Roman" w:hAnsi="Times New Roman"/>
+                <w:b/>
+                <w:sz w:val="21"/>
+              </w:rPr>
+              <w:t>12</w:t>
+            </w:r>
+          </w:p>
+        </w:tc>
+        <w:tc>
+          <w:tcPr>
+            <w:tcW w:type="dxa" w:w="2045"/>
+            <w:shd w:fill="FFFBEB"/>
+          </w:tcPr>
+          <w:p>
+            <w:pPr>
+              <w:jc w:val="center"/>
+            </w:pPr>
+            <w:r>
+              <w:rPr>
+                <w:rFonts w:ascii="Times New Roman" w:hAnsi="Times New Roman"/>
+                <w:b/>
+                <w:sz w:val="21"/>
+              </w:rPr>
+              <w:t>3</w:t>
+            </w:r>
+          </w:p>
+        </w:tc>
+        <w:tc>
+          <w:tcPr>
+            <w:tcW w:type="dxa" w:w="2045"/>
+            <w:shd w:fill="FFFBEB"/>
+          </w:tcPr>
+          <w:p>
+            <w:pPr>
+              <w:jc w:val="center"/>
+            </w:pPr>
+            <w:r>
+              <w:rPr>
+                <w:rFonts w:ascii="Times New Roman" w:hAnsi="Times New Roman"/>
+                <w:b/>
+                <w:sz w:val="21"/>
+              </w:rPr>
+              <w:t>12</w:t>
+            </w:r>
+          </w:p>
+        </w:tc>
+        <w:tc>
+          <w:tcPr>
+            <w:tcW w:type="dxa" w:w="2045"/>
+            <w:shd w:fill="FFFBEB"/>
+          </w:tcPr>
+          <w:p>
+            <w:pPr>
+              <w:jc w:val="center"/>
+            </w:pPr>
+            <w:r>
+              <w:rPr>
+                <w:rFonts w:ascii="Times New Roman" w:hAnsi="Times New Roman"/>
+                <w:b/>
+                <w:sz w:val="21"/>
+              </w:rPr>
+              <w:t>3</w:t>
+            </w:r>
+          </w:p>
+        </w:tc>
+      </w:tr>
+      <w:tr>
+        <w:tc>
+          <w:tcPr>
+            <w:tcW w:type="dxa" w:w="2045"/>
+            <w:shd w:fill="FFFFFF"/>
+          </w:tcPr>
+          <w:p>
+            <w:pPr>
+              <w:jc w:val="center"/>
+            </w:pPr>
+            <w:r>
+              <w:rPr>
+                <w:rFonts w:ascii="Times New Roman" w:hAnsi="Times New Roman"/>
+                <w:b/>
+                <w:sz w:val="21"/>
+              </w:rPr>
+              <w:t>Câu 3</w:t>
+            </w:r>
+          </w:p>
+        </w:tc>
+        <w:tc>
+          <w:tcPr>
+            <w:tcW w:type="dxa" w:w="2045"/>
+            <w:shd w:fill="FFFFFF"/>
+          </w:tcPr>
+          <w:p>
+            <w:pPr>
+              <w:jc w:val="center"/>
+            </w:pPr>
+            <w:r>
+              <w:rPr>
+                <w:rFonts w:ascii="Times New Roman" w:hAnsi="Times New Roman"/>
+                <w:b/>
+                <w:sz w:val="21"/>
+              </w:rPr>
+              <w:t>9</w:t>
+            </w:r>
+          </w:p>
+        </w:tc>
         <w:tc>
           <w:tcPr>
             <w:tcW w:type="dxa" w:w="2045"/>
@@ -2070,6 +2032,44 @@
                 <w:sz w:val="21"/>
               </w:rPr>
               <w:t>12</w:t>
+            </w:r>
+          </w:p>
+        </w:tc>
+        <w:tc>
+          <w:tcPr>
+            <w:tcW w:type="dxa" w:w="2045"/>
+            <w:shd w:fill="FFFFFF"/>
+          </w:tcPr>
+          <w:p>
+            <w:pPr>
+              <w:jc w:val="center"/>
+            </w:pPr>
+            <w:r>
+              <w:rPr>
+                <w:rFonts w:ascii="Times New Roman" w:hAnsi="Times New Roman"/>
+                <w:b/>
+                <w:sz w:val="21"/>
+              </w:rPr>
+              <w:t>9</w:t>
+            </w:r>
+          </w:p>
+        </w:tc>
+        <w:tc>
+          <w:tcPr>
+            <w:tcW w:type="dxa" w:w="2045"/>
+            <w:shd w:fill="FFFFFF"/>
+          </w:tcPr>
+          <w:p>
+            <w:pPr>
+              <w:jc w:val="center"/>
+            </w:pPr>
+            <w:r>
+              <w:rPr>
+                <w:rFonts w:ascii="Times New Roman" w:hAnsi="Times New Roman"/>
+                <w:b/>
+                <w:sz w:val="21"/>
+              </w:rPr>
+              <w:t>9</w:t>
             </w:r>
           </w:p>
         </w:tc>

</xml_diff>

<commit_message>
Support variation tables, function graphs, and science diagrams across PDF/DOCX parsing, shuffling, and export
</commit_message>
<xml_diff>
--- a/exports/Bang_dap_an_tong_hop.docx
+++ b/exports/Bang_dap_an_tong_hop.docx
@@ -205,7 +205,7 @@
                 <w:b/>
                 <w:sz w:val="21"/>
               </w:rPr>
-              <w:t>D</w:t>
+              <w:t>A</w:t>
             </w:r>
           </w:p>
         </w:tc>
@@ -283,7 +283,7 @@
                 <w:b/>
                 <w:sz w:val="21"/>
               </w:rPr>
-              <w:t>A</w:t>
+              <w:t>D</w:t>
             </w:r>
           </w:p>
         </w:tc>
@@ -321,7 +321,7 @@
                 <w:b/>
                 <w:sz w:val="21"/>
               </w:rPr>
-              <w:t>B</w:t>
+              <w:t>C</w:t>
             </w:r>
           </w:p>
         </w:tc>
@@ -340,7 +340,7 @@
                 <w:b/>
                 <w:sz w:val="21"/>
               </w:rPr>
-              <w:t>A</w:t>
+              <w:t>C</w:t>
             </w:r>
           </w:p>
         </w:tc>
@@ -362,25 +362,6 @@
                 <w:sz w:val="21"/>
               </w:rPr>
               <w:t>3</w:t>
-            </w:r>
-          </w:p>
-        </w:tc>
-        <w:tc>
-          <w:tcPr>
-            <w:tcW w:type="dxa" w:w="2045"/>
-            <w:shd w:fill="FFFFFF"/>
-          </w:tcPr>
-          <w:p>
-            <w:pPr>
-              <w:jc w:val="center"/>
-            </w:pPr>
-            <w:r>
-              <w:rPr>
-                <w:rFonts w:ascii="Times New Roman" w:hAnsi="Times New Roman"/>
-                <w:b/>
-                <w:sz w:val="21"/>
-              </w:rPr>
-              <w:t>A</w:t>
             </w:r>
           </w:p>
         </w:tc>
@@ -437,7 +418,26 @@
                 <w:b/>
                 <w:sz w:val="21"/>
               </w:rPr>
-              <w:t>B</w:t>
+              <w:t>A</w:t>
+            </w:r>
+          </w:p>
+        </w:tc>
+        <w:tc>
+          <w:tcPr>
+            <w:tcW w:type="dxa" w:w="2045"/>
+            <w:shd w:fill="FFFFFF"/>
+          </w:tcPr>
+          <w:p>
+            <w:pPr>
+              <w:jc w:val="center"/>
+            </w:pPr>
+            <w:r>
+              <w:rPr>
+                <w:rFonts w:ascii="Times New Roman" w:hAnsi="Times New Roman"/>
+                <w:b/>
+                <w:sz w:val="21"/>
+              </w:rPr>
+              <w:t>C</w:t>
             </w:r>
           </w:p>
         </w:tc>
@@ -459,6 +459,200 @@
                 <w:sz w:val="21"/>
               </w:rPr>
               <w:t>4</w:t>
+            </w:r>
+          </w:p>
+        </w:tc>
+        <w:tc>
+          <w:tcPr>
+            <w:tcW w:type="dxa" w:w="2045"/>
+            <w:shd w:fill="F9FAFB"/>
+          </w:tcPr>
+          <w:p>
+            <w:pPr>
+              <w:jc w:val="center"/>
+            </w:pPr>
+            <w:r>
+              <w:rPr>
+                <w:rFonts w:ascii="Times New Roman" w:hAnsi="Times New Roman"/>
+                <w:b/>
+                <w:sz w:val="21"/>
+              </w:rPr>
+              <w:t>D</w:t>
+            </w:r>
+          </w:p>
+        </w:tc>
+        <w:tc>
+          <w:tcPr>
+            <w:tcW w:type="dxa" w:w="2045"/>
+            <w:shd w:fill="F9FAFB"/>
+          </w:tcPr>
+          <w:p>
+            <w:pPr>
+              <w:jc w:val="center"/>
+            </w:pPr>
+            <w:r>
+              <w:rPr>
+                <w:rFonts w:ascii="Times New Roman" w:hAnsi="Times New Roman"/>
+                <w:b/>
+                <w:sz w:val="21"/>
+              </w:rPr>
+              <w:t>A</w:t>
+            </w:r>
+          </w:p>
+        </w:tc>
+        <w:tc>
+          <w:tcPr>
+            <w:tcW w:type="dxa" w:w="2045"/>
+            <w:shd w:fill="F9FAFB"/>
+          </w:tcPr>
+          <w:p>
+            <w:pPr>
+              <w:jc w:val="center"/>
+            </w:pPr>
+            <w:r>
+              <w:rPr>
+                <w:rFonts w:ascii="Times New Roman" w:hAnsi="Times New Roman"/>
+                <w:b/>
+                <w:sz w:val="21"/>
+              </w:rPr>
+              <w:t>A</w:t>
+            </w:r>
+          </w:p>
+        </w:tc>
+        <w:tc>
+          <w:tcPr>
+            <w:tcW w:type="dxa" w:w="2045"/>
+            <w:shd w:fill="F9FAFB"/>
+          </w:tcPr>
+          <w:p>
+            <w:pPr>
+              <w:jc w:val="center"/>
+            </w:pPr>
+            <w:r>
+              <w:rPr>
+                <w:rFonts w:ascii="Times New Roman" w:hAnsi="Times New Roman"/>
+                <w:b/>
+                <w:sz w:val="21"/>
+              </w:rPr>
+              <w:t>B</w:t>
+            </w:r>
+          </w:p>
+        </w:tc>
+      </w:tr>
+      <w:tr>
+        <w:tc>
+          <w:tcPr>
+            <w:tcW w:type="dxa" w:w="2045"/>
+            <w:shd w:fill="FFFFFF"/>
+          </w:tcPr>
+          <w:p>
+            <w:pPr>
+              <w:jc w:val="center"/>
+            </w:pPr>
+            <w:r>
+              <w:rPr>
+                <w:rFonts w:ascii="Times New Roman" w:hAnsi="Times New Roman"/>
+                <w:b/>
+                <w:sz w:val="21"/>
+              </w:rPr>
+              <w:t>5</w:t>
+            </w:r>
+          </w:p>
+        </w:tc>
+        <w:tc>
+          <w:tcPr>
+            <w:tcW w:type="dxa" w:w="2045"/>
+            <w:shd w:fill="FFFFFF"/>
+          </w:tcPr>
+          <w:p>
+            <w:pPr>
+              <w:jc w:val="center"/>
+            </w:pPr>
+            <w:r>
+              <w:rPr>
+                <w:rFonts w:ascii="Times New Roman" w:hAnsi="Times New Roman"/>
+                <w:b/>
+                <w:sz w:val="21"/>
+              </w:rPr>
+              <w:t>D</w:t>
+            </w:r>
+          </w:p>
+        </w:tc>
+        <w:tc>
+          <w:tcPr>
+            <w:tcW w:type="dxa" w:w="2045"/>
+            <w:shd w:fill="FFFFFF"/>
+          </w:tcPr>
+          <w:p>
+            <w:pPr>
+              <w:jc w:val="center"/>
+            </w:pPr>
+            <w:r>
+              <w:rPr>
+                <w:rFonts w:ascii="Times New Roman" w:hAnsi="Times New Roman"/>
+                <w:b/>
+                <w:sz w:val="21"/>
+              </w:rPr>
+              <w:t>C</w:t>
+            </w:r>
+          </w:p>
+        </w:tc>
+        <w:tc>
+          <w:tcPr>
+            <w:tcW w:type="dxa" w:w="2045"/>
+            <w:shd w:fill="FFFFFF"/>
+          </w:tcPr>
+          <w:p>
+            <w:pPr>
+              <w:jc w:val="center"/>
+            </w:pPr>
+            <w:r>
+              <w:rPr>
+                <w:rFonts w:ascii="Times New Roman" w:hAnsi="Times New Roman"/>
+                <w:b/>
+                <w:sz w:val="21"/>
+              </w:rPr>
+              <w:t>B</w:t>
+            </w:r>
+          </w:p>
+        </w:tc>
+        <w:tc>
+          <w:tcPr>
+            <w:tcW w:type="dxa" w:w="2045"/>
+            <w:shd w:fill="FFFFFF"/>
+          </w:tcPr>
+          <w:p>
+            <w:pPr>
+              <w:jc w:val="center"/>
+            </w:pPr>
+            <w:r>
+              <w:rPr>
+                <w:rFonts w:ascii="Times New Roman" w:hAnsi="Times New Roman"/>
+                <w:b/>
+                <w:sz w:val="21"/>
+              </w:rPr>
+              <w:t>A</w:t>
+            </w:r>
+          </w:p>
+        </w:tc>
+      </w:tr>
+      <w:tr>
+        <w:tc>
+          <w:tcPr>
+            <w:tcW w:type="dxa" w:w="2045"/>
+            <w:shd w:fill="F9FAFB"/>
+          </w:tcPr>
+          <w:p>
+            <w:pPr>
+              <w:jc w:val="center"/>
+            </w:pPr>
+            <w:r>
+              <w:rPr>
+                <w:rFonts w:ascii="Times New Roman" w:hAnsi="Times New Roman"/>
+                <w:b/>
+                <w:sz w:val="21"/>
+              </w:rPr>
+              <w:t>6</w:t>
             </w:r>
           </w:p>
         </w:tc>
@@ -515,162 +709,6 @@
                 <w:b/>
                 <w:sz w:val="21"/>
               </w:rPr>
-              <w:t>C</w:t>
-            </w:r>
-          </w:p>
-        </w:tc>
-        <w:tc>
-          <w:tcPr>
-            <w:tcW w:type="dxa" w:w="2045"/>
-            <w:shd w:fill="F9FAFB"/>
-          </w:tcPr>
-          <w:p>
-            <w:pPr>
-              <w:jc w:val="center"/>
-            </w:pPr>
-            <w:r>
-              <w:rPr>
-                <w:rFonts w:ascii="Times New Roman" w:hAnsi="Times New Roman"/>
-                <w:b/>
-                <w:sz w:val="21"/>
-              </w:rPr>
-              <w:t>A</w:t>
-            </w:r>
-          </w:p>
-        </w:tc>
-      </w:tr>
-      <w:tr>
-        <w:tc>
-          <w:tcPr>
-            <w:tcW w:type="dxa" w:w="2045"/>
-            <w:shd w:fill="FFFFFF"/>
-          </w:tcPr>
-          <w:p>
-            <w:pPr>
-              <w:jc w:val="center"/>
-            </w:pPr>
-            <w:r>
-              <w:rPr>
-                <w:rFonts w:ascii="Times New Roman" w:hAnsi="Times New Roman"/>
-                <w:b/>
-                <w:sz w:val="21"/>
-              </w:rPr>
-              <w:t>5</w:t>
-            </w:r>
-          </w:p>
-        </w:tc>
-        <w:tc>
-          <w:tcPr>
-            <w:tcW w:type="dxa" w:w="2045"/>
-            <w:shd w:fill="FFFFFF"/>
-          </w:tcPr>
-          <w:p>
-            <w:pPr>
-              <w:jc w:val="center"/>
-            </w:pPr>
-            <w:r>
-              <w:rPr>
-                <w:rFonts w:ascii="Times New Roman" w:hAnsi="Times New Roman"/>
-                <w:b/>
-                <w:sz w:val="21"/>
-              </w:rPr>
-              <w:t>C</w:t>
-            </w:r>
-          </w:p>
-        </w:tc>
-        <w:tc>
-          <w:tcPr>
-            <w:tcW w:type="dxa" w:w="2045"/>
-            <w:shd w:fill="FFFFFF"/>
-          </w:tcPr>
-          <w:p>
-            <w:pPr>
-              <w:jc w:val="center"/>
-            </w:pPr>
-            <w:r>
-              <w:rPr>
-                <w:rFonts w:ascii="Times New Roman" w:hAnsi="Times New Roman"/>
-                <w:b/>
-                <w:sz w:val="21"/>
-              </w:rPr>
-              <w:t>D</w:t>
-            </w:r>
-          </w:p>
-        </w:tc>
-        <w:tc>
-          <w:tcPr>
-            <w:tcW w:type="dxa" w:w="2045"/>
-            <w:shd w:fill="FFFFFF"/>
-          </w:tcPr>
-          <w:p>
-            <w:pPr>
-              <w:jc w:val="center"/>
-            </w:pPr>
-            <w:r>
-              <w:rPr>
-                <w:rFonts w:ascii="Times New Roman" w:hAnsi="Times New Roman"/>
-                <w:b/>
-                <w:sz w:val="21"/>
-              </w:rPr>
-              <w:t>B</w:t>
-            </w:r>
-          </w:p>
-        </w:tc>
-        <w:tc>
-          <w:tcPr>
-            <w:tcW w:type="dxa" w:w="2045"/>
-            <w:shd w:fill="FFFFFF"/>
-          </w:tcPr>
-          <w:p>
-            <w:pPr>
-              <w:jc w:val="center"/>
-            </w:pPr>
-            <w:r>
-              <w:rPr>
-                <w:rFonts w:ascii="Times New Roman" w:hAnsi="Times New Roman"/>
-                <w:b/>
-                <w:sz w:val="21"/>
-              </w:rPr>
-              <w:t>B</w:t>
-            </w:r>
-          </w:p>
-        </w:tc>
-      </w:tr>
-      <w:tr>
-        <w:tc>
-          <w:tcPr>
-            <w:tcW w:type="dxa" w:w="2045"/>
-            <w:shd w:fill="F9FAFB"/>
-          </w:tcPr>
-          <w:p>
-            <w:pPr>
-              <w:jc w:val="center"/>
-            </w:pPr>
-            <w:r>
-              <w:rPr>
-                <w:rFonts w:ascii="Times New Roman" w:hAnsi="Times New Roman"/>
-                <w:b/>
-                <w:sz w:val="21"/>
-              </w:rPr>
-              <w:t>6</w:t>
-            </w:r>
-          </w:p>
-        </w:tc>
-        <w:tc>
-          <w:tcPr>
-            <w:tcW w:type="dxa" w:w="2045"/>
-            <w:shd w:fill="F9FAFB"/>
-          </w:tcPr>
-          <w:p>
-            <w:pPr>
-              <w:jc w:val="center"/>
-            </w:pPr>
-            <w:r>
-              <w:rPr>
-                <w:rFonts w:ascii="Times New Roman" w:hAnsi="Times New Roman"/>
-                <w:b/>
-                <w:sz w:val="21"/>
-              </w:rPr>
               <w:t>D</w:t>
             </w:r>
           </w:p>
@@ -691,44 +729,6 @@
                 <w:sz w:val="21"/>
               </w:rPr>
               <w:t>A</w:t>
-            </w:r>
-          </w:p>
-        </w:tc>
-        <w:tc>
-          <w:tcPr>
-            <w:tcW w:type="dxa" w:w="2045"/>
-            <w:shd w:fill="F9FAFB"/>
-          </w:tcPr>
-          <w:p>
-            <w:pPr>
-              <w:jc w:val="center"/>
-            </w:pPr>
-            <w:r>
-              <w:rPr>
-                <w:rFonts w:ascii="Times New Roman" w:hAnsi="Times New Roman"/>
-                <w:b/>
-                <w:sz w:val="21"/>
-              </w:rPr>
-              <w:t>C</w:t>
-            </w:r>
-          </w:p>
-        </w:tc>
-        <w:tc>
-          <w:tcPr>
-            <w:tcW w:type="dxa" w:w="2045"/>
-            <w:shd w:fill="F9FAFB"/>
-          </w:tcPr>
-          <w:p>
-            <w:pPr>
-              <w:jc w:val="center"/>
-            </w:pPr>
-            <w:r>
-              <w:rPr>
-                <w:rFonts w:ascii="Times New Roman" w:hAnsi="Times New Roman"/>
-                <w:b/>
-                <w:sz w:val="21"/>
-              </w:rPr>
-              <w:t>B</w:t>
             </w:r>
           </w:p>
         </w:tc>
@@ -894,205 +894,6 @@
             <w:r>
               <w:rPr>
                 <w:rFonts w:ascii="Times New Roman" w:hAnsi="Times New Roman"/>
-                <w:b/>
-                <w:color w:val="047857"/>
-                <w:sz w:val="21"/>
-              </w:rPr>
-              <w:t>Đ</w:t>
-            </w:r>
-          </w:p>
-        </w:tc>
-        <w:tc>
-          <w:tcPr>
-            <w:tcW w:type="dxa" w:w="2045"/>
-            <w:shd w:fill="FFFFFF"/>
-          </w:tcPr>
-          <w:p>
-            <w:pPr>
-              <w:jc w:val="center"/>
-            </w:pPr>
-            <w:r>
-              <w:rPr>
-                <w:rFonts w:ascii="Times New Roman" w:hAnsi="Times New Roman"/>
-                <w:b/>
-                <w:color w:val="047857"/>
-                <w:sz w:val="21"/>
-              </w:rPr>
-              <w:t>Đ</w:t>
-            </w:r>
-          </w:p>
-        </w:tc>
-        <w:tc>
-          <w:tcPr>
-            <w:tcW w:type="dxa" w:w="2045"/>
-            <w:shd w:fill="FFFFFF"/>
-          </w:tcPr>
-          <w:p>
-            <w:pPr>
-              <w:jc w:val="center"/>
-            </w:pPr>
-            <w:r>
-              <w:rPr>
-                <w:rFonts w:ascii="Times New Roman" w:hAnsi="Times New Roman"/>
-                <w:b/>
-                <w:color w:val="047857"/>
-                <w:sz w:val="21"/>
-              </w:rPr>
-              <w:t>Đ</w:t>
-            </w:r>
-          </w:p>
-        </w:tc>
-        <w:tc>
-          <w:tcPr>
-            <w:tcW w:type="dxa" w:w="2045"/>
-            <w:shd w:fill="FFFFFF"/>
-          </w:tcPr>
-          <w:p>
-            <w:pPr>
-              <w:jc w:val="center"/>
-            </w:pPr>
-            <w:r>
-              <w:rPr>
-                <w:rFonts w:ascii="Times New Roman" w:hAnsi="Times New Roman"/>
-                <w:b w:val="0"/>
-                <w:sz w:val="21"/>
-              </w:rPr>
-              <w:t>S</w:t>
-            </w:r>
-          </w:p>
-        </w:tc>
-      </w:tr>
-      <w:tr>
-        <w:tc>
-          <w:tcPr>
-            <w:tcW w:type="dxa" w:w="2045"/>
-            <w:shd w:fill="F0FDF4"/>
-          </w:tcPr>
-          <w:p>
-            <w:pPr>
-              <w:jc w:val="center"/>
-            </w:pPr>
-            <w:r>
-              <w:rPr>
-                <w:rFonts w:ascii="Times New Roman" w:hAnsi="Times New Roman"/>
-                <w:b/>
-                <w:sz w:val="21"/>
-              </w:rPr>
-              <w:t>Câu 1.b</w:t>
-            </w:r>
-          </w:p>
-        </w:tc>
-        <w:tc>
-          <w:tcPr>
-            <w:tcW w:type="dxa" w:w="2045"/>
-            <w:shd w:fill="F0FDF4"/>
-          </w:tcPr>
-          <w:p>
-            <w:pPr>
-              <w:jc w:val="center"/>
-            </w:pPr>
-            <w:r>
-              <w:rPr>
-                <w:rFonts w:ascii="Times New Roman" w:hAnsi="Times New Roman"/>
-                <w:b/>
-                <w:color w:val="047857"/>
-                <w:sz w:val="21"/>
-              </w:rPr>
-              <w:t>Đ</w:t>
-            </w:r>
-          </w:p>
-        </w:tc>
-        <w:tc>
-          <w:tcPr>
-            <w:tcW w:type="dxa" w:w="2045"/>
-            <w:shd w:fill="F0FDF4"/>
-          </w:tcPr>
-          <w:p>
-            <w:pPr>
-              <w:jc w:val="center"/>
-            </w:pPr>
-            <w:r>
-              <w:rPr>
-                <w:rFonts w:ascii="Times New Roman" w:hAnsi="Times New Roman"/>
-                <w:b w:val="0"/>
-                <w:sz w:val="21"/>
-              </w:rPr>
-              <w:t>S</w:t>
-            </w:r>
-          </w:p>
-        </w:tc>
-        <w:tc>
-          <w:tcPr>
-            <w:tcW w:type="dxa" w:w="2045"/>
-            <w:shd w:fill="F0FDF4"/>
-          </w:tcPr>
-          <w:p>
-            <w:pPr>
-              <w:jc w:val="center"/>
-            </w:pPr>
-            <w:r>
-              <w:rPr>
-                <w:rFonts w:ascii="Times New Roman" w:hAnsi="Times New Roman"/>
-                <w:b w:val="0"/>
-                <w:sz w:val="21"/>
-              </w:rPr>
-              <w:t>S</w:t>
-            </w:r>
-          </w:p>
-        </w:tc>
-        <w:tc>
-          <w:tcPr>
-            <w:tcW w:type="dxa" w:w="2045"/>
-            <w:shd w:fill="F0FDF4"/>
-          </w:tcPr>
-          <w:p>
-            <w:pPr>
-              <w:jc w:val="center"/>
-            </w:pPr>
-            <w:r>
-              <w:rPr>
-                <w:rFonts w:ascii="Times New Roman" w:hAnsi="Times New Roman"/>
-                <w:b/>
-                <w:color w:val="047857"/>
-                <w:sz w:val="21"/>
-              </w:rPr>
-              <w:t>Đ</w:t>
-            </w:r>
-          </w:p>
-        </w:tc>
-      </w:tr>
-      <w:tr>
-        <w:tc>
-          <w:tcPr>
-            <w:tcW w:type="dxa" w:w="2045"/>
-            <w:shd w:fill="FFFFFF"/>
-          </w:tcPr>
-          <w:p>
-            <w:pPr>
-              <w:jc w:val="center"/>
-            </w:pPr>
-            <w:r>
-              <w:rPr>
-                <w:rFonts w:ascii="Times New Roman" w:hAnsi="Times New Roman"/>
-                <w:b/>
-                <w:sz w:val="21"/>
-              </w:rPr>
-              <w:t>Câu 1.c</w:t>
-            </w:r>
-          </w:p>
-        </w:tc>
-        <w:tc>
-          <w:tcPr>
-            <w:tcW w:type="dxa" w:w="2045"/>
-            <w:shd w:fill="FFFFFF"/>
-          </w:tcPr>
-          <w:p>
-            <w:pPr>
-              <w:jc w:val="center"/>
-            </w:pPr>
-            <w:r>
-              <w:rPr>
-                <w:rFonts w:ascii="Times New Roman" w:hAnsi="Times New Roman"/>
                 <w:b w:val="0"/>
                 <w:sz w:val="21"/>
               </w:rPr>
@@ -1156,6 +957,205 @@
                 <w:sz w:val="21"/>
               </w:rPr>
               <w:t>Đ</w:t>
+            </w:r>
+          </w:p>
+        </w:tc>
+      </w:tr>
+      <w:tr>
+        <w:tc>
+          <w:tcPr>
+            <w:tcW w:type="dxa" w:w="2045"/>
+            <w:shd w:fill="F0FDF4"/>
+          </w:tcPr>
+          <w:p>
+            <w:pPr>
+              <w:jc w:val="center"/>
+            </w:pPr>
+            <w:r>
+              <w:rPr>
+                <w:rFonts w:ascii="Times New Roman" w:hAnsi="Times New Roman"/>
+                <w:b/>
+                <w:sz w:val="21"/>
+              </w:rPr>
+              <w:t>Câu 1.b</w:t>
+            </w:r>
+          </w:p>
+        </w:tc>
+        <w:tc>
+          <w:tcPr>
+            <w:tcW w:type="dxa" w:w="2045"/>
+            <w:shd w:fill="F0FDF4"/>
+          </w:tcPr>
+          <w:p>
+            <w:pPr>
+              <w:jc w:val="center"/>
+            </w:pPr>
+            <w:r>
+              <w:rPr>
+                <w:rFonts w:ascii="Times New Roman" w:hAnsi="Times New Roman"/>
+                <w:b/>
+                <w:color w:val="047857"/>
+                <w:sz w:val="21"/>
+              </w:rPr>
+              <w:t>Đ</w:t>
+            </w:r>
+          </w:p>
+        </w:tc>
+        <w:tc>
+          <w:tcPr>
+            <w:tcW w:type="dxa" w:w="2045"/>
+            <w:shd w:fill="F0FDF4"/>
+          </w:tcPr>
+          <w:p>
+            <w:pPr>
+              <w:jc w:val="center"/>
+            </w:pPr>
+            <w:r>
+              <w:rPr>
+                <w:rFonts w:ascii="Times New Roman" w:hAnsi="Times New Roman"/>
+                <w:b/>
+                <w:color w:val="047857"/>
+                <w:sz w:val="21"/>
+              </w:rPr>
+              <w:t>Đ</w:t>
+            </w:r>
+          </w:p>
+        </w:tc>
+        <w:tc>
+          <w:tcPr>
+            <w:tcW w:type="dxa" w:w="2045"/>
+            <w:shd w:fill="F0FDF4"/>
+          </w:tcPr>
+          <w:p>
+            <w:pPr>
+              <w:jc w:val="center"/>
+            </w:pPr>
+            <w:r>
+              <w:rPr>
+                <w:rFonts w:ascii="Times New Roman" w:hAnsi="Times New Roman"/>
+                <w:b/>
+                <w:color w:val="047857"/>
+                <w:sz w:val="21"/>
+              </w:rPr>
+              <w:t>Đ</w:t>
+            </w:r>
+          </w:p>
+        </w:tc>
+        <w:tc>
+          <w:tcPr>
+            <w:tcW w:type="dxa" w:w="2045"/>
+            <w:shd w:fill="F0FDF4"/>
+          </w:tcPr>
+          <w:p>
+            <w:pPr>
+              <w:jc w:val="center"/>
+            </w:pPr>
+            <w:r>
+              <w:rPr>
+                <w:rFonts w:ascii="Times New Roman" w:hAnsi="Times New Roman"/>
+                <w:b/>
+                <w:color w:val="047857"/>
+                <w:sz w:val="21"/>
+              </w:rPr>
+              <w:t>Đ</w:t>
+            </w:r>
+          </w:p>
+        </w:tc>
+      </w:tr>
+      <w:tr>
+        <w:tc>
+          <w:tcPr>
+            <w:tcW w:type="dxa" w:w="2045"/>
+            <w:shd w:fill="FFFFFF"/>
+          </w:tcPr>
+          <w:p>
+            <w:pPr>
+              <w:jc w:val="center"/>
+            </w:pPr>
+            <w:r>
+              <w:rPr>
+                <w:rFonts w:ascii="Times New Roman" w:hAnsi="Times New Roman"/>
+                <w:b/>
+                <w:sz w:val="21"/>
+              </w:rPr>
+              <w:t>Câu 1.c</w:t>
+            </w:r>
+          </w:p>
+        </w:tc>
+        <w:tc>
+          <w:tcPr>
+            <w:tcW w:type="dxa" w:w="2045"/>
+            <w:shd w:fill="FFFFFF"/>
+          </w:tcPr>
+          <w:p>
+            <w:pPr>
+              <w:jc w:val="center"/>
+            </w:pPr>
+            <w:r>
+              <w:rPr>
+                <w:rFonts w:ascii="Times New Roman" w:hAnsi="Times New Roman"/>
+                <w:b/>
+                <w:color w:val="047857"/>
+                <w:sz w:val="21"/>
+              </w:rPr>
+              <w:t>Đ</w:t>
+            </w:r>
+          </w:p>
+        </w:tc>
+        <w:tc>
+          <w:tcPr>
+            <w:tcW w:type="dxa" w:w="2045"/>
+            <w:shd w:fill="FFFFFF"/>
+          </w:tcPr>
+          <w:p>
+            <w:pPr>
+              <w:jc w:val="center"/>
+            </w:pPr>
+            <w:r>
+              <w:rPr>
+                <w:rFonts w:ascii="Times New Roman" w:hAnsi="Times New Roman"/>
+                <w:b w:val="0"/>
+                <w:sz w:val="21"/>
+              </w:rPr>
+              <w:t>S</w:t>
+            </w:r>
+          </w:p>
+        </w:tc>
+        <w:tc>
+          <w:tcPr>
+            <w:tcW w:type="dxa" w:w="2045"/>
+            <w:shd w:fill="FFFFFF"/>
+          </w:tcPr>
+          <w:p>
+            <w:pPr>
+              <w:jc w:val="center"/>
+            </w:pPr>
+            <w:r>
+              <w:rPr>
+                <w:rFonts w:ascii="Times New Roman" w:hAnsi="Times New Roman"/>
+                <w:b w:val="0"/>
+                <w:sz w:val="21"/>
+              </w:rPr>
+              <w:t>S</w:t>
+            </w:r>
+          </w:p>
+        </w:tc>
+        <w:tc>
+          <w:tcPr>
+            <w:tcW w:type="dxa" w:w="2045"/>
+            <w:shd w:fill="FFFFFF"/>
+          </w:tcPr>
+          <w:p>
+            <w:pPr>
+              <w:jc w:val="center"/>
+            </w:pPr>
+            <w:r>
+              <w:rPr>
+                <w:rFonts w:ascii="Times New Roman" w:hAnsi="Times New Roman"/>
+                <w:b w:val="0"/>
+                <w:sz w:val="21"/>
+              </w:rPr>
+              <w:t>S</w:t>
             </w:r>
           </w:p>
         </w:tc>
@@ -1309,10 +1309,11 @@
             <w:r>
               <w:rPr>
                 <w:rFonts w:ascii="Times New Roman" w:hAnsi="Times New Roman"/>
-                <w:b w:val="0"/>
+                <w:b/>
+                <w:color w:val="047857"/>
                 <w:sz w:val="21"/>
               </w:rPr>
-              <w:t>S</w:t>
+              <w:t>Đ</w:t>
             </w:r>
           </w:p>
         </w:tc>
@@ -1347,10 +1348,11 @@
             <w:r>
               <w:rPr>
                 <w:rFonts w:ascii="Times New Roman" w:hAnsi="Times New Roman"/>
-                <w:b w:val="0"/>
+                <w:b/>
+                <w:color w:val="047857"/>
                 <w:sz w:val="21"/>
               </w:rPr>
-              <w:t>S</w:t>
+              <w:t>Đ</w:t>
             </w:r>
           </w:p>
         </w:tc>
@@ -1407,11 +1409,10 @@
             <w:r>
               <w:rPr>
                 <w:rFonts w:ascii="Times New Roman" w:hAnsi="Times New Roman"/>
-                <w:b/>
-                <w:color w:val="047857"/>
+                <w:b w:val="0"/>
                 <w:sz w:val="21"/>
               </w:rPr>
-              <w:t>Đ</w:t>
+              <w:t>S</w:t>
             </w:r>
           </w:p>
         </w:tc>
@@ -1447,11 +1448,10 @@
             <w:r>
               <w:rPr>
                 <w:rFonts w:ascii="Times New Roman" w:hAnsi="Times New Roman"/>
-                <w:b/>
-                <w:color w:val="047857"/>
+                <w:b w:val="0"/>
                 <w:sz w:val="21"/>
               </w:rPr>
-              <w:t>Đ</w:t>
+              <w:t>S</w:t>
             </w:r>
           </w:p>
         </w:tc>
@@ -1837,6 +1837,25 @@
                 <w:b/>
                 <w:sz w:val="21"/>
               </w:rPr>
+              <w:t>3</w:t>
+            </w:r>
+          </w:p>
+        </w:tc>
+        <w:tc>
+          <w:tcPr>
+            <w:tcW w:type="dxa" w:w="2045"/>
+            <w:shd w:fill="FFFFFF"/>
+          </w:tcPr>
+          <w:p>
+            <w:pPr>
+              <w:jc w:val="center"/>
+            </w:pPr>
+            <w:r>
+              <w:rPr>
+                <w:rFonts w:ascii="Times New Roman" w:hAnsi="Times New Roman"/>
+                <w:b/>
+                <w:sz w:val="21"/>
+              </w:rPr>
               <w:t>9</w:t>
             </w:r>
           </w:p>
@@ -1856,26 +1875,7 @@
                 <w:b/>
                 <w:sz w:val="21"/>
               </w:rPr>
-              <w:t>3</w:t>
-            </w:r>
-          </w:p>
-        </w:tc>
-        <w:tc>
-          <w:tcPr>
-            <w:tcW w:type="dxa" w:w="2045"/>
-            <w:shd w:fill="FFFFFF"/>
-          </w:tcPr>
-          <w:p>
-            <w:pPr>
-              <w:jc w:val="center"/>
-            </w:pPr>
-            <w:r>
-              <w:rPr>
-                <w:rFonts w:ascii="Times New Roman" w:hAnsi="Times New Roman"/>
-                <w:b/>
-                <w:sz w:val="21"/>
-              </w:rPr>
-              <w:t>12</w:t>
+              <w:t>9</w:t>
             </w:r>
           </w:p>
         </w:tc>
@@ -1934,7 +1934,7 @@
                 <w:b/>
                 <w:sz w:val="21"/>
               </w:rPr>
-              <w:t>3</w:t>
+              <w:t>9</w:t>
             </w:r>
           </w:p>
         </w:tc>
@@ -1972,7 +1972,7 @@
                 <w:b/>
                 <w:sz w:val="21"/>
               </w:rPr>
-              <w:t>3</w:t>
+              <w:t>12</w:t>
             </w:r>
           </w:p>
         </w:tc>
@@ -2050,7 +2050,7 @@
                 <w:b/>
                 <w:sz w:val="21"/>
               </w:rPr>
-              <w:t>9</w:t>
+              <w:t>3</w:t>
             </w:r>
           </w:p>
         </w:tc>
@@ -2069,7 +2069,7 @@
                 <w:b/>
                 <w:sz w:val="21"/>
               </w:rPr>
-              <w:t>9</w:t>
+              <w:t>3</w:t>
             </w:r>
           </w:p>
         </w:tc>

</xml_diff>